<commit_message>
Final corrections to Excel and Word files
Excel:
- Observations now displays as integer (not 61.0000)
- Alpha/Beta/SE use 6 decimal places for precision
- t-stats/R²/Appraisal use 4 decimal places, F-stat uses 2

Word:
- Fixed VFIAX β(SMB) = -0.1501 (t=-6.55): highly significant at 1%,
  correctly explained as large-cap structural tilt, NOT 'close to zero'
- Fixed VFIAX β(HML) = 0.0300 (t=2.08): significant at 5%, updated text
- Fixed b.2) appraisal ratio: added breakdown table showing alpha and
  residual std dev, corrected explanation of why VFIAX ratio is higher
- Fixed 1.d closing paragraph with actual R² improvement numbers

https://claude.ai/code/session_01UFgKuhfYfoTRdFuN7kHBHu
</commit_message>
<xml_diff>
--- a/Finance_Homework_Answers.docx
+++ b/Finance_Homework_Answers.docx
@@ -482,15 +482,167 @@
       </w:r>
     </w:p>
     <w:p>
+      <w:pPr>
+        <w:pStyle w:val="IntenseQuote"/>
+      </w:pPr>
       <w:r>
-        <w:t>AAPL Appraisal Ratio = 0.0787</w:t>
-        <w:br/>
-        <w:t>VFIAX Appraisal Ratio = 0.1482</w:t>
+        <w:t>Calculations:</w:t>
+      </w:r>
+    </w:p>
+    <w:tbl>
+      <w:tblPr>
+        <w:tblStyle w:val="LightShading-Accent1"/>
+        <w:tblW w:type="auto" w:w="0"/>
+        <w:tblLook w:firstColumn="1" w:firstRow="1" w:lastColumn="0" w:lastRow="0" w:noHBand="0" w:noVBand="1" w:val="04A0"/>
+      </w:tblPr>
+      <w:tblGrid>
+        <w:gridCol w:w="2880"/>
+        <w:gridCol w:w="2880"/>
+        <w:gridCol w:w="2880"/>
+      </w:tblGrid>
+      <w:tr>
+        <w:tc>
+          <w:tcPr>
+            <w:tcW w:type="dxa" w:w="2880"/>
+          </w:tcPr>
+          <w:p>
+            <w:r>
+              <w:t>Component</w:t>
+            </w:r>
+          </w:p>
+        </w:tc>
+        <w:tc>
+          <w:tcPr>
+            <w:tcW w:type="dxa" w:w="2880"/>
+          </w:tcPr>
+          <w:p>
+            <w:r>
+              <w:t>AAPL</w:t>
+            </w:r>
+          </w:p>
+        </w:tc>
+        <w:tc>
+          <w:tcPr>
+            <w:tcW w:type="dxa" w:w="2880"/>
+          </w:tcPr>
+          <w:p>
+            <w:r>
+              <w:t>VFIAX</w:t>
+            </w:r>
+          </w:p>
+        </w:tc>
+      </w:tr>
+      <w:tr>
+        <w:tc>
+          <w:tcPr>
+            <w:tcW w:type="dxa" w:w="2880"/>
+          </w:tcPr>
+          <w:p>
+            <w:r>
+              <w:t>Alpha (α)</w:t>
+            </w:r>
+          </w:p>
+        </w:tc>
+        <w:tc>
+          <w:tcPr>
+            <w:tcW w:type="dxa" w:w="2880"/>
+          </w:tcPr>
+          <w:p>
+            <w:r>
+              <w:t>0.004044</w:t>
+            </w:r>
+          </w:p>
+        </w:tc>
+        <w:tc>
+          <w:tcPr>
+            <w:tcW w:type="dxa" w:w="2880"/>
+          </w:tcPr>
+          <w:p>
+            <w:r>
+              <w:t>0.000883</w:t>
+            </w:r>
+          </w:p>
+        </w:tc>
+      </w:tr>
+      <w:tr>
+        <w:tc>
+          <w:tcPr>
+            <w:tcW w:type="dxa" w:w="2880"/>
+          </w:tcPr>
+          <w:p>
+            <w:r>
+              <w:t>Std Dev of Residuals (σ_ε)</w:t>
+            </w:r>
+          </w:p>
+        </w:tc>
+        <w:tc>
+          <w:tcPr>
+            <w:tcW w:type="dxa" w:w="2880"/>
+          </w:tcPr>
+          <w:p>
+            <w:r>
+              <w:t>0.051407</w:t>
+            </w:r>
+          </w:p>
+        </w:tc>
+        <w:tc>
+          <w:tcPr>
+            <w:tcW w:type="dxa" w:w="2880"/>
+          </w:tcPr>
+          <w:p>
+            <w:r>
+              <w:t>0.005955</w:t>
+            </w:r>
+          </w:p>
+        </w:tc>
+      </w:tr>
+      <w:tr>
+        <w:tc>
+          <w:tcPr>
+            <w:tcW w:type="dxa" w:w="2880"/>
+          </w:tcPr>
+          <w:p>
+            <w:r>
+              <w:t>Appraisal Ratio = α / σ_ε</w:t>
+            </w:r>
+          </w:p>
+        </w:tc>
+        <w:tc>
+          <w:tcPr>
+            <w:tcW w:type="dxa" w:w="2880"/>
+          </w:tcPr>
+          <w:p>
+            <w:r>
+              <w:t>0.0787</w:t>
+            </w:r>
+          </w:p>
+        </w:tc>
+        <w:tc>
+          <w:tcPr>
+            <w:tcW w:type="dxa" w:w="2880"/>
+          </w:tcPr>
+          <w:p>
+            <w:r>
+              <w:t>0.1482</w:t>
+            </w:r>
+          </w:p>
+        </w:tc>
+      </w:tr>
+    </w:tbl>
+    <w:p/>
+    <w:p>
+      <w:r>
+        <w:t>VFIAX has the higher appraisal ratio (0.1482 vs 0.0787 for AAPL).</w:t>
       </w:r>
     </w:p>
     <w:p>
       <w:r>
-        <w:t>In absolute terms, VFIAX has the better appraisal ratio. VFIAX, as an index fund, is expected to have an appraisal ratio very close to zero because its alpha should be approximately zero. Any non-zero appraisal ratio for VFIAX reflects minor tracking errors relative to the Fama-French market factor.</w:t>
+        <w:t>At first glance this may seem surprising for a passive index fund. The reason lies in the denominator: VFIAX's residual standard deviation is extremely small (0.005955) because it tracks the market nearly perfectly (R² = 0.9814). Even though its alpha (0.000883) is tiny, dividing by an even tinier residual standard deviation produces a non-trivial appraisal ratio. Economically, this small positive alpha reflects the fact that the S&amp;P 500 (which VFIAX tracks) has historically slightly outperformed the Fama-French Mkt-RF factor used as the benchmark here.</w:t>
+      </w:r>
+    </w:p>
+    <w:p>
+      <w:r>
+        <w:t>AAPL has a larger alpha (0.004044) but also a much larger residual standard deviation (0.051407), reflecting substantial firm-specific (idiosyncratic) risk. This large unsystematic risk dilutes the alpha, resulting in a lower appraisal ratio (0.0787).</w:t>
       </w:r>
     </w:p>
     <w:p>
@@ -939,22 +1091,22 @@
     </w:p>
     <w:p>
       <w:r>
-        <w:t>β(Mkt-RF) = 1.0133: Very close to 1.0, as expected for an S&amp;P 500 index fund. The fund's returns move almost one-for-one with the market.</w:t>
+        <w:t>β(Mkt-RF) = 1.0133: Very close to 1.0, as expected for an S&amp;P 500 index fund. The fund's returns move almost one-for-one with the market. β(Mkt-RF) (t = 70.8142) is statistically significant at the 1% level (|t| &gt; 2.66).</w:t>
       </w:r>
     </w:p>
     <w:p>
       <w:r>
-        <w:t>β(SMB) = -0.1501: Close to zero, as the S&amp;P 500 is a large-cap index and does not have significant small-cap exposure.</w:t>
+        <w:t>β(SMB) = -0.1501: This negative and statistically significant loading (β(SMB) (t = -6.5545) is statistically significant at the 1% level (|t| &gt; 2.66).) reflects that the S&amp;P 500 is a large-cap index. Large-cap stocks systematically underperform small-cap stocks on the SMB factor, so VFIAX loads negatively on SMB. This is an expected structural feature, not active management.</w:t>
       </w:r>
     </w:p>
     <w:p>
       <w:r>
-        <w:t>β(HML) = 0.0300: Close to zero, reflecting the broad market blend of value and growth stocks in the S&amp;P 500.</w:t>
+        <w:t>β(HML) = 0.0300: β(HML) (t = 2.0781) is statistically significant at the 5% level (|t| &gt; 2.00). The S&amp;P 500 contains a blend of value and growth stocks; a slightly positive HML loading suggests a mild tilt toward value stocks in the index composition during this period.</w:t>
       </w:r>
     </w:p>
     <w:p>
       <w:r>
-        <w:t>β(Mom) = -0.0151: Close to zero, as a diversified index fund should not have significant momentum exposure.</w:t>
+        <w:t>β(Mom) = -0.0151: β(Mom) (t = -0.8519) is NOT statistically significant at conventional levels (|t| &lt; 1.67). As a fully diversified index fund, VFIAX has no deliberate momentum strategy, so near-zero momentum exposure is expected.</w:t>
       </w:r>
     </w:p>
     <w:p>
@@ -997,7 +1149,7 @@
     </w:p>
     <w:p>
       <w:r>
-        <w:t>Comparing across models, both AAPL and VFIAX have (weakly) higher R-squared values in the four-factor model than in the market model, confirming that the additional factors provide incremental explanatory power.</w:t>
+        <w:t>Comparing across models: AAPL's R² improved from 0.4531 to 0.5319 (+0.0788), a meaningful gain showing that SMB, HML, and Mom capture additional variation in AAPL's returns beyond just market risk. VFIAX's R² improved more modestly from 0.9814 to 0.9900 (+0.0086), mainly due to the highly significant negative SMB loading — the large-cap nature of the S&amp;P 500 is a systematic factor not fully captured by Mkt-RF alone.</w:t>
       </w:r>
     </w:p>
     <w:sectPr>

</xml_diff>